<commit_message>
fix: Arreglar indices de documentos
</commit_message>
<xml_diff>
--- a/docs/Requerimientos funcionales y no funcionales.docx
+++ b/docs/Requerimientos funcionales y no funcionales.docx
@@ -918,7 +918,21 @@
           <w:b/>
           <w:bCs/>
         </w:rPr>
-        <w:t xml:space="preserve">RF03 - Gestión de </w:t>
+        <w:t xml:space="preserve">RF03 - </w:t>
+      </w:r>
+      <w:r>
+        <w:rPr>
+          <w:b/>
+          <w:bCs/>
+        </w:rPr>
+        <w:t>Selección</w:t>
+      </w:r>
+      <w:r>
+        <w:rPr>
+          <w:b/>
+          <w:bCs/>
+        </w:rPr>
+        <w:t xml:space="preserve"> de </w:t>
       </w:r>
       <w:r>
         <w:rPr>
@@ -1198,7 +1212,13 @@
         <w:t>ambios de estatus</w:t>
       </w:r>
       <w:r>
-        <w:t xml:space="preserve"> a “seguimiento”</w:t>
+        <w:t xml:space="preserve"> a “</w:t>
+      </w:r>
+      <w:r>
+        <w:t>S</w:t>
+      </w:r>
+      <w:r>
+        <w:t>eguimiento”</w:t>
       </w:r>
       <w:r>
         <w:t>.</w:t>
@@ -1326,7 +1346,10 @@
         <w:t xml:space="preserve"> un caso cerrado, cambiando su estatus a "</w:t>
       </w:r>
       <w:r>
-        <w:t>reabierto</w:t>
+        <w:t>R</w:t>
+      </w:r>
+      <w:r>
+        <w:t>eabierto</w:t>
       </w:r>
       <w:r>
         <w:t xml:space="preserve">" y permitiendo modificar únicamente el campo de </w:t>
@@ -1358,7 +1381,7 @@
           <w:b/>
           <w:bCs/>
         </w:rPr>
-        <w:t>Emisión</w:t>
+        <w:t>Gestión</w:t>
       </w:r>
       <w:r>
         <w:rPr>
@@ -1663,6 +1686,39 @@
       </w:r>
     </w:p>
     <w:p>
+      <w:pPr>
+        <w:pStyle w:val="ListParagraph"/>
+        <w:numPr>
+          <w:ilvl w:val="0"/>
+          <w:numId w:val="23"/>
+        </w:numPr>
+      </w:pPr>
+      <w:r>
+        <w:rPr>
+          <w:b/>
+          <w:bCs/>
+        </w:rPr>
+        <w:t>RF</w:t>
+      </w:r>
+      <w:r>
+        <w:rPr>
+          <w:b/>
+          <w:bCs/>
+        </w:rPr>
+        <w:t>14</w:t>
+      </w:r>
+      <w:r>
+        <w:rPr>
+          <w:b/>
+          <w:bCs/>
+        </w:rPr>
+        <w:t xml:space="preserve"> - Trazabilidad y auditoría</w:t>
+      </w:r>
+      <w:r>
+        <w:t>: el sistema debe registrar automáticamente de forma interna los datos para auditoría, permitiendo su consulta posterior.</w:t>
+      </w:r>
+    </w:p>
+    <w:p>
       <w:r>
         <w:br w:type="page"/>
       </w:r>
@@ -1790,21 +1846,21 @@
           <w:b/>
           <w:bCs/>
         </w:rPr>
-        <w:t xml:space="preserve">RNF03 - Trazabilidad y </w:t>
-      </w:r>
-      <w:r>
-        <w:rPr>
-          <w:b/>
-          <w:bCs/>
-        </w:rPr>
-        <w:t>a</w:t>
-      </w:r>
-      <w:r>
-        <w:rPr>
-          <w:b/>
-          <w:bCs/>
-        </w:rPr>
-        <w:t>uditoría</w:t>
+        <w:t>RNF0</w:t>
+      </w:r>
+      <w:r>
+        <w:rPr>
+          <w:b/>
+          <w:bCs/>
+        </w:rPr>
+        <w:t>3</w:t>
+      </w:r>
+      <w:r>
+        <w:rPr>
+          <w:b/>
+          <w:bCs/>
+        </w:rPr>
+        <w:t xml:space="preserve"> - Organización del equipo</w:t>
       </w:r>
       <w:r>
         <w:t xml:space="preserve">: </w:t>
@@ -1813,7 +1869,19 @@
         <w:t>e</w:t>
       </w:r>
       <w:r>
-        <w:t>l sistema debe registrar automáticamente de forma interna los datos para auditoría, permitiendo su consulta posterior.</w:t>
+        <w:t xml:space="preserve">l proyecto debe ser realizado estrictamente </w:t>
+      </w:r>
+      <w:r>
+        <w:t>por un equipo</w:t>
+      </w:r>
+      <w:r>
+        <w:t xml:space="preserve"> de </w:t>
+      </w:r>
+      <w:r>
+        <w:t>dos</w:t>
+      </w:r>
+      <w:r>
+        <w:t xml:space="preserve"> personas.</w:t>
       </w:r>
     </w:p>
     <w:p>
@@ -1829,7 +1897,35 @@
           <w:b/>
           <w:bCs/>
         </w:rPr>
-        <w:t>RNF04 - Organización del equipo</w:t>
+        <w:t>RNF0</w:t>
+      </w:r>
+      <w:r>
+        <w:rPr>
+          <w:b/>
+          <w:bCs/>
+        </w:rPr>
+        <w:t>4</w:t>
+      </w:r>
+      <w:r>
+        <w:rPr>
+          <w:b/>
+          <w:bCs/>
+        </w:rPr>
+        <w:t xml:space="preserve"> - Metodología de </w:t>
+      </w:r>
+      <w:r>
+        <w:rPr>
+          <w:b/>
+          <w:bCs/>
+        </w:rPr>
+        <w:t>d</w:t>
+      </w:r>
+      <w:r>
+        <w:rPr>
+          <w:b/>
+          <w:bCs/>
+        </w:rPr>
+        <w:t>esarrollo</w:t>
       </w:r>
       <w:r>
         <w:t xml:space="preserve">: </w:t>
@@ -1838,19 +1934,13 @@
         <w:t>e</w:t>
       </w:r>
       <w:r>
-        <w:t xml:space="preserve">l proyecto debe ser realizado estrictamente </w:t>
-      </w:r>
-      <w:r>
-        <w:t>por un equipo</w:t>
-      </w:r>
-      <w:r>
-        <w:t xml:space="preserve"> de </w:t>
-      </w:r>
-      <w:r>
-        <w:t>dos</w:t>
-      </w:r>
-      <w:r>
-        <w:t xml:space="preserve"> personas.</w:t>
+        <w:t xml:space="preserve">l proyecto debe seguir y documentar una metodología de desarrollo </w:t>
+      </w:r>
+      <w:r>
+        <w:t xml:space="preserve">rigurosa y formal </w:t>
+      </w:r>
+      <w:r>
+        <w:t>vista en clase.</w:t>
       </w:r>
     </w:p>
     <w:p>
@@ -1880,36 +1970,61 @@
           <w:b/>
           <w:bCs/>
         </w:rPr>
-        <w:t xml:space="preserve"> - Metodología de </w:t>
-      </w:r>
-      <w:r>
-        <w:rPr>
-          <w:b/>
-          <w:bCs/>
-        </w:rPr>
+        <w:t xml:space="preserve"> </w:t>
+      </w:r>
+      <w:r>
+        <w:rPr>
+          <w:b/>
+          <w:bCs/>
+        </w:rPr>
+        <w:t>-</w:t>
+      </w:r>
+      <w:r>
+        <w:rPr>
+          <w:b/>
+          <w:bCs/>
+        </w:rPr>
+        <w:t xml:space="preserve"> </w:t>
+      </w:r>
+      <w:r>
+        <w:rPr>
+          <w:b/>
+          <w:bCs/>
+        </w:rPr>
+        <w:t>Patrones de diseño</w:t>
+      </w:r>
+      <w:r>
+        <w:t xml:space="preserve">: </w:t>
+      </w:r>
+      <w:r>
+        <w:t>e</w:t>
+      </w:r>
+      <w:r>
+        <w:t xml:space="preserve">l </w:t>
+      </w:r>
+      <w:r>
+        <w:t>desarrollo debe incluir</w:t>
+      </w:r>
+      <w:r>
+        <w:t xml:space="preserve"> </w:t>
+      </w:r>
+      <w:r>
+        <w:t>p</w:t>
+      </w:r>
+      <w:r>
+        <w:t xml:space="preserve">atrones de </w:t>
+      </w:r>
+      <w:r>
         <w:t>d</w:t>
       </w:r>
       <w:r>
-        <w:rPr>
-          <w:b/>
-          <w:bCs/>
-        </w:rPr>
-        <w:t>esarrollo</w:t>
-      </w:r>
-      <w:r>
-        <w:t xml:space="preserve">: </w:t>
-      </w:r>
-      <w:r>
-        <w:t>e</w:t>
-      </w:r>
-      <w:r>
-        <w:t xml:space="preserve">l proyecto debe seguir y documentar una metodología de desarrollo </w:t>
-      </w:r>
-      <w:r>
-        <w:t xml:space="preserve">rigurosa y formal </w:t>
-      </w:r>
-      <w:r>
-        <w:t>vista en clase.</w:t>
+        <w:t xml:space="preserve">iseño vistos </w:t>
+      </w:r>
+      <w:r>
+        <w:t>en clase</w:t>
+      </w:r>
+      <w:r>
+        <w:t>.</w:t>
       </w:r>
     </w:p>
     <w:p>
@@ -1939,61 +2054,28 @@
           <w:b/>
           <w:bCs/>
         </w:rPr>
-        <w:t xml:space="preserve"> </w:t>
-      </w:r>
-      <w:r>
-        <w:rPr>
-          <w:b/>
-          <w:bCs/>
-        </w:rPr>
-        <w:t>-</w:t>
-      </w:r>
-      <w:r>
-        <w:rPr>
-          <w:b/>
-          <w:bCs/>
-        </w:rPr>
-        <w:t xml:space="preserve"> </w:t>
-      </w:r>
-      <w:r>
-        <w:rPr>
-          <w:b/>
-          <w:bCs/>
-        </w:rPr>
-        <w:t>Patrones de diseño</w:t>
+        <w:t xml:space="preserve"> - Documentación técnica</w:t>
       </w:r>
       <w:r>
         <w:t xml:space="preserve">: </w:t>
       </w:r>
       <w:r>
-        <w:t>e</w:t>
-      </w:r>
-      <w:r>
-        <w:t xml:space="preserve">l </w:t>
-      </w:r>
-      <w:r>
-        <w:t>desarrollo debe incluir</w:t>
-      </w:r>
-      <w:r>
-        <w:t xml:space="preserve"> </w:t>
-      </w:r>
-      <w:r>
-        <w:t>p</w:t>
-      </w:r>
-      <w:r>
-        <w:t xml:space="preserve">atrones de </w:t>
-      </w:r>
-      <w:r>
-        <w:t>d</w:t>
-      </w:r>
-      <w:r>
-        <w:t xml:space="preserve">iseño vistos </w:t>
-      </w:r>
-      <w:r>
-        <w:t>en clase</w:t>
-      </w:r>
-      <w:r>
-        <w:t>.</w:t>
+        <w:t>s</w:t>
+      </w:r>
+      <w:r>
+        <w:t>e requiere la entrega de diagramas de casos de uso, secuencia</w:t>
+      </w:r>
+      <w:r>
+        <w:t xml:space="preserve"> y</w:t>
+      </w:r>
+      <w:r>
+        <w:t>/</w:t>
+      </w:r>
+      <w:r>
+        <w:t xml:space="preserve">o </w:t>
+      </w:r>
+      <w:r>
+        <w:t>colaboración, diagramas de clases y prototipo de interfaz.</w:t>
       </w:r>
     </w:p>
     <w:p>
@@ -2009,44 +2091,21 @@
           <w:b/>
           <w:bCs/>
         </w:rPr>
-        <w:t>RNF07 - Documentación técnica</w:t>
-      </w:r>
-      <w:r>
-        <w:t xml:space="preserve">: </w:t>
-      </w:r>
-      <w:r>
-        <w:t>s</w:t>
-      </w:r>
-      <w:r>
-        <w:t>e requiere la entrega de diagramas de casos de uso, secuencia</w:t>
-      </w:r>
-      <w:r>
-        <w:t xml:space="preserve"> y</w:t>
-      </w:r>
-      <w:r>
-        <w:t>/</w:t>
-      </w:r>
-      <w:r>
-        <w:t xml:space="preserve">o </w:t>
-      </w:r>
-      <w:r>
-        <w:t>colaboración, diagramas de clases y prototipo de interfaz.</w:t>
-      </w:r>
-    </w:p>
-    <w:p>
-      <w:pPr>
-        <w:pStyle w:val="ListParagraph"/>
-        <w:numPr>
-          <w:ilvl w:val="0"/>
-          <w:numId w:val="24"/>
-        </w:numPr>
-      </w:pPr>
-      <w:r>
-        <w:rPr>
-          <w:b/>
-          <w:bCs/>
-        </w:rPr>
-        <w:t>RNF08 - Entrega del programa</w:t>
+        <w:t>RNF0</w:t>
+      </w:r>
+      <w:r>
+        <w:rPr>
+          <w:b/>
+          <w:bCs/>
+        </w:rPr>
+        <w:t>7</w:t>
+      </w:r>
+      <w:r>
+        <w:rPr>
+          <w:b/>
+          <w:bCs/>
+        </w:rPr>
+        <w:t xml:space="preserve"> - Entrega del programa</w:t>
       </w:r>
       <w:r>
         <w:t xml:space="preserve">: </w:t>
@@ -6288,28 +6347,28 @@
 </file>
 
 <file path=customXml/item1.xml><?xml version="1.0" encoding="utf-8"?>
-<b:Sources xmlns:b="http://schemas.openxmlformats.org/officeDocument/2006/bibliography" xmlns="http://schemas.openxmlformats.org/officeDocument/2006/bibliography" SelectedStyle="\APASixthEditionOfficeOnline.xsl" StyleName="APA" Version="6"/>
-</file>
-
-<file path=customXml/item2.xml><?xml version="1.0" encoding="utf-8"?>
 <go:gDocsCustomXmlDataStorage xmlns:go="http://customooxmlschemas.google.com/" xmlns:r="http://schemas.openxmlformats.org/officeDocument/2006/relationships" uri="GoogleDocsCustomDataVersion2">
   <go:docsCustomData xmlns:go="http://customooxmlschemas.google.com/" roundtripDataSignature="AMtx7mizGexCOIC7/NtQ4c+I1nJn5NLzFw==">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</go:docsCustomData>
 </go:gDocsCustomXmlDataStorage>
 </file>
 
-<file path=customXml/itemProps1.xml><?xml version="1.0" encoding="utf-8"?>
-<ds:datastoreItem xmlns:ds="http://schemas.openxmlformats.org/officeDocument/2006/customXml" ds:itemID="{A959B552-8D78-43F1-8486-B90E55463D4E}">
-  <ds:schemaRefs>
-    <ds:schemaRef ds:uri="http://schemas.openxmlformats.org/officeDocument/2006/bibliography"/>
-  </ds:schemaRefs>
-</ds:datastoreItem>
+<file path=customXml/item2.xml><?xml version="1.0" encoding="utf-8"?>
+<b:Sources xmlns:b="http://schemas.openxmlformats.org/officeDocument/2006/bibliography" xmlns="http://schemas.openxmlformats.org/officeDocument/2006/bibliography" SelectedStyle="\APASixthEditionOfficeOnline.xsl" StyleName="APA" Version="6"/>
 </file>
 
-<file path=customXml/itemProps2.xml><?xml version="1.0" encoding="utf-8"?>
+<file path=customXml/itemProps1.xml><?xml version="1.0" encoding="utf-8"?>
 <ds:datastoreItem xmlns:ds="http://schemas.openxmlformats.org/officeDocument/2006/customXml" ds:itemID="{11111111-1234-1234-1234-123412341234}">
   <ds:schemaRefs>
     <ds:schemaRef ds:uri="http://customooxmlschemas.google.com/"/>
     <ds:schemaRef ds:uri="http://schemas.openxmlformats.org/officeDocument/2006/relationships"/>
   </ds:schemaRefs>
 </ds:datastoreItem>
+</file>
+
+<file path=customXml/itemProps2.xml><?xml version="1.0" encoding="utf-8"?>
+<ds:datastoreItem xmlns:ds="http://schemas.openxmlformats.org/officeDocument/2006/customXml" ds:itemID="{A959B552-8D78-43F1-8486-B90E55463D4E}">
+  <ds:schemaRefs>
+    <ds:schemaRef ds:uri="http://schemas.openxmlformats.org/officeDocument/2006/bibliography"/>
+  </ds:schemaRefs>
+</ds:datastoreItem>
 </file>
</xml_diff>